<commit_message>
style: fix teal theme consistency and improve recap template
- Fix step indicator in Recap pane (was blue, now teal)
- Recap template: section headings larger (16pt), dark navy color, spacing
- Recap template: bullets regular weight (removed bold), relaxed spacing
- Recap template: owner labels bold navy with group spacing
- Recap template: add "Overview" to session type title line
- Nav: remove emoji icons for clean minimal text-only sidebar

Co-Authored-By: Claude Sonnet 4.6 <noreply@anthropic.com>
</commit_message>
<xml_diff>
--- a/assets/recap-template.docx
+++ b/assets/recap-template.docx
@@ -325,7 +325,7 @@
           <w:sz w:val="40"/>
           <w:szCs w:val="40"/>
         </w:rPr>
-        <w:t xml:space="preserve">{session_type}  | {session_label}</w:t>
+        <w:t xml:space="preserve">{session_type}  Overview  |  {session_label}</w:t>
       </w:r>
     </w:p>
     <w:p>
@@ -551,14 +551,14 @@
     </w:p>
     <w:p>
       <w:pPr>
-        <w:spacing w:after="0" w:line="240" w:lineRule="auto"/>
+        <w:spacing w:before="320" w:after="100" w:line="276" w:lineRule="auto"/>
         <w:rPr>
           <w:rFonts w:ascii="Barlow" w:eastAsia="Times New Roman" w:hAnsi="Barlow" w:cs="Times New Roman"/>
           <w:b/>
           <w:bCs/>
-          <w:color w:val="auto"/>
-          <w:sz w:val="28"/>
-          <w:szCs w:val="28"/>
+          <w:color w:val="1B3A6B"/>
+          <w:sz w:val="32"/>
+          <w:szCs w:val="32"/>
         </w:rPr>
       </w:pPr>
       <w:r>
@@ -566,9 +566,9 @@
           <w:rFonts w:ascii="Barlow" w:eastAsia="Times New Roman" w:hAnsi="Barlow" w:cs="Times New Roman"/>
           <w:b/>
           <w:bCs/>
-          <w:color w:val="auto"/>
-          <w:sz w:val="28"/>
-          <w:szCs w:val="28"/>
+          <w:color w:val="1B3A6B"/>
+          <w:sz w:val="32"/>
+          <w:szCs w:val="32"/>
         </w:rPr>
         <w:t>{heading}</w:t>
       </w:r>
@@ -585,11 +585,9 @@
           <w:ilvl w:val="0"/>
           <w:numId w:val="89"/>
         </w:numPr>
-        <w:spacing w:after="0" w:line="240" w:lineRule="auto"/>
+        <w:spacing w:before="40" w:after="100" w:line="276" w:lineRule="auto"/>
         <w:rPr>
           <w:rFonts w:ascii="Barlow" w:eastAsia="Times New Roman" w:hAnsi="Barlow" w:cs="Times New Roman"/>
-          <w:b/>
-          <w:bCs/>
           <w:color w:val="auto"/>
           <w:sz w:val="24"/>
           <w:szCs w:val="24"/>
@@ -598,8 +596,6 @@
       <w:r>
         <w:rPr>
           <w:rFonts w:ascii="Barlow" w:eastAsia="Times New Roman" w:hAnsi="Barlow" w:cs="Times New Roman"/>
-          <w:b/>
-          <w:bCs/>
           <w:color w:val="auto"/>
           <w:sz w:val="24"/>
           <w:szCs w:val="24"/>
@@ -648,19 +644,14 @@
     </w:p>
     <w:p>
       <w:pPr>
-        <w:pStyle w:val="ListParagraph"/>
-        <w:numPr>
-          <w:ilvl w:val="0"/>
-          <w:numId w:val="89"/>
-        </w:numPr>
-        <w:spacing w:after="0" w:line="240" w:lineRule="auto"/>
+        <w:spacing w:before="200" w:after="60" w:line="276" w:lineRule="auto"/>
         <w:rPr>
           <w:rFonts w:ascii="Barlow" w:eastAsia="Times New Roman" w:hAnsi="Barlow" w:cs="Times New Roman"/>
           <w:b/>
           <w:bCs/>
-          <w:color w:val="auto"/>
-          <w:sz w:val="24"/>
-          <w:szCs w:val="24"/>
+          <w:color w:val="1B3A6B"/>
+          <w:sz w:val="26"/>
+          <w:szCs w:val="26"/>
         </w:rPr>
       </w:pPr>
       <w:r>
@@ -668,9 +659,9 @@
           <w:rFonts w:ascii="Barlow" w:eastAsia="Times New Roman" w:hAnsi="Barlow" w:cs="Times New Roman"/>
           <w:b/>
           <w:bCs/>
-          <w:color w:val="auto"/>
-          <w:sz w:val="24"/>
-          <w:szCs w:val="24"/>
+          <w:color w:val="1B3A6B"/>
+          <w:sz w:val="26"/>
+          <w:szCs w:val="26"/>
         </w:rPr>
         <w:t>{owner}</w:t>
       </w:r>
@@ -687,11 +678,9 @@
           <w:ilvl w:val="0"/>
           <w:numId w:val="89"/>
         </w:numPr>
-        <w:spacing w:after="0" w:line="240" w:lineRule="auto"/>
+        <w:spacing w:before="40" w:after="100" w:line="276" w:lineRule="auto"/>
         <w:rPr>
           <w:rFonts w:ascii="Barlow" w:eastAsia="Times New Roman" w:hAnsi="Barlow" w:cs="Times New Roman"/>
-          <w:b/>
-          <w:bCs/>
           <w:color w:val="auto"/>
           <w:sz w:val="24"/>
           <w:szCs w:val="24"/>
@@ -700,8 +689,6 @@
       <w:r>
         <w:rPr>
           <w:rFonts w:ascii="Barlow" w:eastAsia="Times New Roman" w:hAnsi="Barlow" w:cs="Times New Roman"/>
-          <w:b/>
-          <w:bCs/>
           <w:color w:val="auto"/>
           <w:sz w:val="24"/>
           <w:szCs w:val="24"/>
@@ -755,11 +742,9 @@
           <w:ilvl w:val="0"/>
           <w:numId w:val="89"/>
         </w:numPr>
-        <w:spacing w:after="0" w:line="240" w:lineRule="auto"/>
+        <w:spacing w:before="40" w:after="100" w:line="276" w:lineRule="auto"/>
         <w:rPr>
           <w:rFonts w:ascii="Barlow" w:eastAsia="Times New Roman" w:hAnsi="Barlow" w:cs="Times New Roman"/>
-          <w:b/>
-          <w:bCs/>
           <w:color w:val="auto"/>
           <w:sz w:val="24"/>
           <w:szCs w:val="24"/>
@@ -768,8 +753,6 @@
       <w:r>
         <w:rPr>
           <w:rFonts w:ascii="Barlow" w:eastAsia="Times New Roman" w:hAnsi="Barlow" w:cs="Times New Roman"/>
-          <w:b/>
-          <w:bCs/>
           <w:color w:val="auto"/>
           <w:sz w:val="24"/>
           <w:szCs w:val="24"/>

</xml_diff>